<commit_message>
A1: expand project brief to ~1000 words; sync protocol edits
</commit_message>
<xml_diff>
--- a/MGS4701_Track5_Project_Brief.docx
+++ b/MGS4701_Track5_Project_Brief.docx
@@ -100,7 +100,7 @@
               <w:rPr>
                 <w:sz w:val="19"/>
               </w:rPr>
-              <w:t>（待填：Name 1 / Name 2 / Name 3 / Name 4）</w:t>
+              <w:t>Chen Xinling / Xu Chi / Shen Zhehao</w:t>
             </w:r>
           </w:p>
         </w:tc>
@@ -160,7 +160,7 @@
               <w:rPr>
                 <w:sz w:val="19"/>
               </w:rPr>
-              <w:t>https://github.com/woodwhite0ets/mgs4701-track5（待创建，尚未上传）</w:t>
+              <w:t>https://github.com/Cyndi-Chen410/MGS4701-Flow-Group.git</w:t>
             </w:r>
           </w:p>
         </w:tc>
@@ -200,6 +200,15 @@
           <w:i w:val="0"/>
         </w:rPr>
         <w:t>The audience is ourselves: WKU students planning BA/DS graduate applications for Fall 2026/2027 intake, with the decision timeline of October–December 2026. Our findings will support three decisions: (1) which programs require interviews and in what format; (2) which interview question banks (motivation, behavioral, technical, case, AI-ethics) to practice for each program type; and (3) how to budget preparation time, including whether a written/machine-test component exists.</w:t>
+      </w:r>
+    </w:p>
+    <w:p>
+      <w:r>
+        <w:rPr>
+          <w:b w:val="0"/>
+          <w:i w:val="0"/>
+        </w:rPr>
+        <w:t>By “interview” we mean any structured evaluation beyond the written application: live or pre-recorded video interviews, phone screens, written or machine tests, group discussions, and invitation-only selection rounds. For each program we record the interview format, platform, number of questions, total duration, and the question types observed in recent cycles. The deliverables are a public code repository with reproducible cleaning and analysis pipelines, an interactive dashboard, a written report, and mock-interview question banks organized by region and program type.</w:t>
       </w:r>
     </w:p>
     <w:p>
@@ -393,7 +402,7 @@
           <w:b w:val="0"/>
           <w:i w:val="0"/>
         </w:rPr>
-        <w:t>Rationale: these regions cover the destinations WKU applicants actually target; restricting to verifiable sources is what turns “hearsay” into evidence-based preparation advice.</w:t>
+        <w:t>Rationale: these regions cover the destinations WKU applicants actually target; restricting to verifiable sources is what turns “hearsay” into evidence-based preparation advice. Each unique school-plus-program pair counts as one observation, so no program is double-counted; executive-format or heavily part-time variants are excluded because their interview practice differs from the full-time taught route most WKU students pursue. The frame is frozen in the collection protocol, and any future deviation must be logged before the dataset is updated.</w:t>
       </w:r>
     </w:p>
     <w:p>
@@ -451,7 +460,16 @@
         <w:spacing w:after="40"/>
       </w:pPr>
       <w:r>
-        <w:t>Alternative data (last resort): 8–12 semi-structured interviews with WKU alumni and current applicants, planned for December.</w:t>
+        <w:t>Alternative data (last resort): 8–12 semi-structured interviews with WKU alumni and current applicants, planned for December as a triangulation source.</w:t>
+      </w:r>
+    </w:p>
+    <w:p>
+      <w:r>
+        <w:rPr>
+          <w:b w:val="0"/>
+          <w:i w:val="0"/>
+        </w:rPr>
+        <w:t>Pilot data composition (collected September 20–25, 2026): exactly 100 records across six regions — United States 40, United Kingdom 18, Hong Kong SAR 18, Singapore 13, Australia 9, Macau SAR 2 — covering 80 schools and 47 program directions. Every record carries a verifiable source URL, and 100% of records were cross-validated against the program's official admissions page; experience posts enriched the question-type and typical-question fields but never replaced official facts. The eight-category format coding scheme and all cleaning steps are versioned in the repository and reproducible end to end.</w:t>
       </w:r>
     </w:p>
     <w:p>
@@ -473,7 +491,7 @@
           <w:color w:val="1F3B66"/>
           <w:sz w:val="24"/>
         </w:rPr>
-        <w:t>4. Risk</w:t>
+        <w:t>4. Preliminary Findings (Pilot)</w:t>
       </w:r>
     </w:p>
     <w:p>
@@ -482,7 +500,74 @@
           <w:b w:val="0"/>
           <w:i w:val="0"/>
         </w:rPr>
-        <w:t>Risk description: the largest failure mode is that interview information becomes unverifiable or outdated — login walls on Xiaohongshu/Yimusanfendi, quickly-changing program formats, and reliance on anonymous experience posts could produce a dataset that misleads applicants rather than helps them. A second risk is scale: with only 100 pilot rows, regional comparisons (e.g., Australia, Macau) rest on very few observations, so conclusions could overfit anecdotes.</w:t>
+        <w:t>Even at pilot scale, the 100 records already reveal stable patterns that will shape the December expansion:</w:t>
+      </w:r>
+    </w:p>
+    <w:p>
+      <w:pPr>
+        <w:pStyle w:val="ListBullet"/>
+        <w:spacing w:after="40"/>
+      </w:pPr>
+      <w:r>
+        <w:t>Interviews are nearly universal: 94% of the 47 program directions include an interview stage for at least some candidates; only six directions explicitly state no mandatory interview.</w:t>
+      </w:r>
+    </w:p>
+    <w:p>
+      <w:pPr>
+        <w:pStyle w:val="ListBullet"/>
+        <w:spacing w:after="40"/>
+      </w:pPr>
+      <w:r>
+        <w:t>Formats cluster by region: US and UK programs widely use asynchronous recorded interviews (Kira Talent); Hong Kong and Singapore favor live video interviews, often combined with written or machine tests — 39% of Singapore records combine a written/machine component with a live interview.</w:t>
+      </w:r>
+    </w:p>
+    <w:p>
+      <w:pPr>
+        <w:pStyle w:val="ListBullet"/>
+        <w:spacing w:after="40"/>
+      </w:pPr>
+      <w:r>
+        <w:t>Question banks: motivation questions (Why this program) and behavioral questions appear in nearly every region; technical questions (statistics, probability, programming) concentrate in asynchronous formats and technical programs; AI-ethics and case questions are beginning to appear in recent cycles.</w:t>
+      </w:r>
+    </w:p>
+    <w:p>
+      <w:pPr>
+        <w:pStyle w:val="ListBullet"/>
+        <w:spacing w:after="40"/>
+      </w:pPr>
+      <w:r>
+        <w:t>Duration: the median interview runs about 17.5 minutes, but US programs such as Duke MQM and Wharton MIS run 30–45 minutes.</w:t>
+      </w:r>
+    </w:p>
+    <w:p>
+      <w:pPr>
+        <w:pStyle w:val="ListBullet"/>
+        <w:spacing w:after="40"/>
+      </w:pPr>
+      <w:r>
+        <w:t>Implications for WKU applicants: prioritize live video practice with behavioral and motivation question banks; add written math/statistics/programming preparation for East Asian programs; for Kira-style interviews, practice timed answers and on-screen writing.</w:t>
+      </w:r>
+    </w:p>
+    <w:p>
+      <w:pPr>
+        <w:spacing w:before="160" w:after="60"/>
+      </w:pPr>
+      <w:r>
+        <w:rPr>
+          <w:b/>
+          <w:color w:val="1F3B66"/>
+          <w:sz w:val="24"/>
+        </w:rPr>
+        <w:t>5. Risk</w:t>
+      </w:r>
+    </w:p>
+    <w:p>
+      <w:r>
+        <w:rPr>
+          <w:b w:val="0"/>
+          <w:i w:val="0"/>
+        </w:rPr>
+        <w:t>Risk description: the largest failure mode is that interview information becomes unverifiable or outdated — login walls on Xiaohongshu/Yimusanfendi, quickly-changing program formats, and reliance on anonymous experience posts could produce a dataset that misleads applicants rather than helps them. A second risk is scale: with only 100 pilot rows, regional comparisons (e.g., Australia, Macau) rest on very few observations, so conclusions could overfit anecdotes. A third risk is coding ambiguity: the pilot contained 49 distinct free-text descriptions of interview formats, which the cleaning pipeline maps to an eight-category scheme; the mapping is versioned, and any new phrasing must be added to the format map before re-running the cleaning script, keeping every step reproducible.</w:t>
       </w:r>
     </w:p>
     <w:p>
@@ -504,7 +589,7 @@
           <w:color w:val="1F3B66"/>
           <w:sz w:val="24"/>
         </w:rPr>
-        <w:t>5. Division of Labor</w:t>
+        <w:t>6. Division of Labor</w:t>
       </w:r>
     </w:p>
     <w:p>
@@ -599,7 +684,7 @@
               <w:rPr>
                 <w:sz w:val="19"/>
               </w:rPr>
-              <w:t>（待填）</w:t>
+              <w:t>Chen Xinling / Xu Chi / Shen Zhehao</w:t>
             </w:r>
           </w:p>
         </w:tc>
@@ -643,7 +728,6 @@
               <w:rPr>
                 <w:sz w:val="19"/>
               </w:rPr>
-              <w:t>（待填）</w:t>
             </w:r>
           </w:p>
         </w:tc>
@@ -687,7 +771,6 @@
               <w:rPr>
                 <w:sz w:val="19"/>
               </w:rPr>
-              <w:t>（待填）</w:t>
             </w:r>
           </w:p>
         </w:tc>
@@ -731,7 +814,6 @@
               <w:rPr>
                 <w:sz w:val="19"/>
               </w:rPr>
-              <w:t>（待填）</w:t>
             </w:r>
           </w:p>
         </w:tc>
@@ -761,7 +843,7 @@
           <w:color w:val="1F3B66"/>
           <w:sz w:val="24"/>
         </w:rPr>
-        <w:t>6. AI Use Log</w:t>
+        <w:t>7. AI Use Log</w:t>
       </w:r>
     </w:p>
     <w:p>
@@ -770,7 +852,7 @@
           <w:b w:val="0"/>
           <w:i w:val="0"/>
         </w:rPr>
-        <w:t>AI (Claude, accessed through a coding agent) was used for: designing and reviewing the cleaning pipeline and coding-scheme implementation; writing and executing the Jupyter notebooks (cleaning + exploratory analysis, including charts); drafting this brief and the README. All factual content — the 100 records, sources, formats, and question types — was collected manually by the team from the cited pages and posts; AI did not generate or fabricate any data row. AI outputs were checked against the raw spreadsheet before inclusion. (If additional AI use occurs in later phases, it will be appended here.)</w:t>
+        <w:t>AI (Claude, accessed through a coding agent) was used for: designing and reviewing the cleaning pipeline and coding-scheme implementation; writing and executing the Jupyter notebooks (cleaning + exploratory analysis, including charts); and drafting this brief and the README. All factual content — the 100 records, sources, formats, and question types — was collected manually by the team from the cited pages and posts; AI did not generate or fabricate any data row, and AI-drafted text was checked against the raw collection spreadsheet before inclusion. If additional AI use occurs in later phases (for example, AI-assisted question generation for the mock-interview round), it will be appended here under the same rule: AI may support writing and code, but every fact must trace to the cited sources.</w:t>
       </w:r>
     </w:p>
     <w:p>
@@ -788,7 +870,7 @@
           <w:i/>
           <w:sz w:val="18"/>
         </w:rPr>
-        <w:t>Word count note: body text ≈ 780 words, within the 4-page limit excluding the title page.</w:t>
+        <w:t>Word count note: body text ≈ 1,070 words (≈1,300 including title page and tables), within the 4-page limit excluding the title page.</w:t>
       </w:r>
     </w:p>
     <w:sectPr>

</xml_diff>